<commit_message>
fix: preservar codigo de barras original de plantilla Jumbo y eliminar resaltado amarillo en asteriscos de subtotal
</commit_message>
<xml_diff>
--- a/plantillas_base/EXITO.docx
+++ b/plantillas_base/EXITO.docx
@@ -10,7 +10,6 @@
       <w:r>
         <w:rPr>
           <w:sz w:val="18"/>
-          <w:highlight w:val="yellow"/>
         </w:rPr>
         <w:t>EXITO WOW RIONEGRO</w:t>
       </w:r>
@@ -65,9 +64,7 @@
         <w:t xml:space="preserve">NUMERO: </w:t>
       </w:r>
       <w:r>
-        <w:rPr>
-          <w:highlight w:val="yellow"/>
-        </w:rPr>
+        <w:rPr/>
         <w:t>WJ5344660</w:t>
       </w:r>
     </w:p>
@@ -129,9 +126,7 @@
         <w:keepLines/>
       </w:pPr>
       <w:r>
-        <w:rPr>
-          <w:highlight w:val="yellow"/>
-        </w:rPr>
+        <w:rPr/>
         <w:t>2026-08-06 08:30:08</w:t>
       </w:r>
       <w:r>
@@ -195,340 +190,249 @@
     <w:p>
       <w:pPr>
         <w:keepLines/>
-        <w:rPr>
-          <w:highlight w:val="yellow"/>
-        </w:rPr>
+        <w:rPr/>
       </w:pPr>
       <w:r>
         <w:rPr>
           <w:b/>
           <w:bCs/>
-          <w:highlight w:val="yellow"/>
         </w:rPr>
         <w:t>1</w:t>
       </w:r>
       <w:r>
-        <w:rPr>
-          <w:highlight w:val="yellow"/>
-        </w:rPr>
+        <w:rPr/>
         <w:t xml:space="preserve"> 1/u x 3.365.000 </w:t>
       </w:r>
       <w:proofErr w:type="spellStart"/>
       <w:proofErr w:type="gramStart"/>
       <w:r>
-        <w:rPr>
-          <w:highlight w:val="yellow"/>
-        </w:rPr>
+        <w:rPr/>
         <w:t>V.Ahorro</w:t>
       </w:r>
       <w:proofErr w:type="spellEnd"/>
       <w:proofErr w:type="gramEnd"/>
       <w:r>
-        <w:rPr>
-          <w:highlight w:val="yellow"/>
-        </w:rPr>
+        <w:rPr/>
         <w:t xml:space="preserve"> 0</w:t>
       </w:r>
     </w:p>
     <w:p>
       <w:pPr>
         <w:keepLines/>
-        <w:rPr>
-          <w:highlight w:val="yellow"/>
-        </w:rPr>
+        <w:rPr/>
       </w:pPr>
       <w:r>
-        <w:rPr>
-          <w:highlight w:val="yellow"/>
-        </w:rPr>
+        <w:rPr/>
         <w:t xml:space="preserve">3100827 </w:t>
       </w:r>
       <w:proofErr w:type="spellStart"/>
       <w:r>
-        <w:rPr>
-          <w:highlight w:val="yellow"/>
-        </w:rPr>
+        <w:rPr/>
         <w:t>Nevera</w:t>
       </w:r>
       <w:proofErr w:type="spellEnd"/>
       <w:r>
-        <w:rPr>
-          <w:highlight w:val="yellow"/>
-        </w:rPr>
+        <w:rPr/>
         <w:t xml:space="preserve"> DOOR COOLING </w:t>
       </w:r>
     </w:p>
     <w:p>
       <w:pPr>
         <w:keepLines/>
-        <w:rPr>
-          <w:highlight w:val="yellow"/>
-        </w:rPr>
+        <w:rPr/>
       </w:pPr>
       <w:r>
-        <w:rPr>
-          <w:highlight w:val="yellow"/>
-        </w:rPr>
+        <w:rPr/>
         <w:t xml:space="preserve">LG No Frost Tipo </w:t>
       </w:r>
       <w:proofErr w:type="spellStart"/>
       <w:r>
-        <w:rPr>
-          <w:highlight w:val="yellow"/>
-        </w:rPr>
+        <w:rPr/>
         <w:t>europeo</w:t>
       </w:r>
       <w:proofErr w:type="spellEnd"/>
       <w:r>
-        <w:rPr>
-          <w:highlight w:val="yellow"/>
-        </w:rPr>
+        <w:rPr/>
         <w:t xml:space="preserve"> 420</w:t>
       </w:r>
     </w:p>
     <w:p>
       <w:pPr>
         <w:keepLines/>
-        <w:rPr>
-          <w:highlight w:val="yellow"/>
-        </w:rPr>
+        <w:rPr/>
       </w:pPr>
       <w:proofErr w:type="spellStart"/>
       <w:r>
-        <w:rPr>
-          <w:highlight w:val="yellow"/>
-        </w:rPr>
+        <w:rPr/>
         <w:t>Lts</w:t>
       </w:r>
       <w:proofErr w:type="spellEnd"/>
       <w:r>
-        <w:rPr>
-          <w:highlight w:val="yellow"/>
-        </w:rPr>
+        <w:rPr/>
         <w:t xml:space="preserve"> GB41WPPAP Gris             3.365.000A</w:t>
       </w:r>
     </w:p>
     <w:p>
       <w:pPr>
         <w:keepLines/>
-        <w:rPr>
-          <w:highlight w:val="yellow"/>
-        </w:rPr>
+        <w:rPr/>
       </w:pPr>
       <w:r>
         <w:rPr>
           <w:b/>
           <w:bCs/>
-          <w:highlight w:val="yellow"/>
         </w:rPr>
         <w:t>2</w:t>
       </w:r>
       <w:r>
-        <w:rPr>
-          <w:highlight w:val="yellow"/>
-        </w:rPr>
+        <w:rPr/>
         <w:t xml:space="preserve"> 1/u x 5.500.267 </w:t>
       </w:r>
       <w:proofErr w:type="spellStart"/>
       <w:proofErr w:type="gramStart"/>
       <w:r>
-        <w:rPr>
-          <w:highlight w:val="yellow"/>
-        </w:rPr>
+        <w:rPr/>
         <w:t>V.Ahorro</w:t>
       </w:r>
       <w:proofErr w:type="spellEnd"/>
       <w:proofErr w:type="gramEnd"/>
       <w:r>
-        <w:rPr>
-          <w:highlight w:val="yellow"/>
-        </w:rPr>
+        <w:rPr/>
         <w:t xml:space="preserve"> 0</w:t>
       </w:r>
     </w:p>
     <w:p>
       <w:pPr>
         <w:keepLines/>
-        <w:rPr>
-          <w:highlight w:val="yellow"/>
-        </w:rPr>
+        <w:rPr/>
       </w:pPr>
       <w:r>
-        <w:rPr>
-          <w:highlight w:val="yellow"/>
-        </w:rPr>
+        <w:rPr/>
         <w:t xml:space="preserve">3110648 </w:t>
       </w:r>
       <w:proofErr w:type="spellStart"/>
       <w:r>
-        <w:rPr>
-          <w:highlight w:val="yellow"/>
-        </w:rPr>
+        <w:rPr/>
         <w:t>Nevecón</w:t>
       </w:r>
       <w:proofErr w:type="spellEnd"/>
       <w:r>
-        <w:rPr>
-          <w:highlight w:val="yellow"/>
-        </w:rPr>
+        <w:rPr/>
         <w:t xml:space="preserve"> SAMSUNG Tipo</w:t>
       </w:r>
     </w:p>
     <w:p>
       <w:pPr>
         <w:keepLines/>
-        <w:rPr>
-          <w:highlight w:val="yellow"/>
-        </w:rPr>
+        <w:rPr/>
       </w:pPr>
       <w:r>
-        <w:rPr>
-          <w:highlight w:val="yellow"/>
-        </w:rPr>
+        <w:rPr/>
         <w:t xml:space="preserve">Europeo625 </w:t>
       </w:r>
       <w:proofErr w:type="spellStart"/>
       <w:r>
-        <w:rPr>
-          <w:highlight w:val="yellow"/>
-        </w:rPr>
+        <w:rPr/>
         <w:t>Lts</w:t>
       </w:r>
       <w:proofErr w:type="spellEnd"/>
       <w:r>
-        <w:rPr>
-          <w:highlight w:val="yellow"/>
-        </w:rPr>
+        <w:rPr/>
         <w:t xml:space="preserve"> RF22A4220SG/CO</w:t>
       </w:r>
     </w:p>
     <w:p>
       <w:pPr>
         <w:keepLines/>
-        <w:rPr>
-          <w:highlight w:val="yellow"/>
-        </w:rPr>
+        <w:rPr/>
       </w:pPr>
       <w:r>
-        <w:rPr>
-          <w:highlight w:val="yellow"/>
-        </w:rPr>
+        <w:rPr/>
         <w:t xml:space="preserve">Gris </w:t>
       </w:r>
       <w:proofErr w:type="spellStart"/>
       <w:r>
-        <w:rPr>
-          <w:highlight w:val="yellow"/>
-        </w:rPr>
+        <w:rPr/>
         <w:t>oscuro</w:t>
       </w:r>
       <w:proofErr w:type="spellEnd"/>
       <w:r>
-        <w:rPr>
-          <w:highlight w:val="yellow"/>
-        </w:rPr>
+        <w:rPr/>
         <w:t xml:space="preserve">                    5.500.267A</w:t>
       </w:r>
     </w:p>
     <w:p>
       <w:pPr>
         <w:keepLines/>
-        <w:rPr>
-          <w:highlight w:val="yellow"/>
-        </w:rPr>
+        <w:rPr/>
       </w:pPr>
       <w:r>
         <w:rPr>
           <w:b/>
           <w:bCs/>
-          <w:highlight w:val="yellow"/>
         </w:rPr>
         <w:t>3</w:t>
       </w:r>
       <w:r>
-        <w:rPr>
-          <w:highlight w:val="yellow"/>
-        </w:rPr>
+        <w:rPr/>
         <w:t xml:space="preserve"> 1/u x 1.637.935 </w:t>
       </w:r>
       <w:proofErr w:type="spellStart"/>
       <w:proofErr w:type="gramStart"/>
       <w:r>
-        <w:rPr>
-          <w:highlight w:val="yellow"/>
-        </w:rPr>
+        <w:rPr/>
         <w:t>V.Ahorro</w:t>
       </w:r>
       <w:proofErr w:type="spellEnd"/>
       <w:proofErr w:type="gramEnd"/>
       <w:r>
-        <w:rPr>
-          <w:highlight w:val="yellow"/>
-        </w:rPr>
+        <w:rPr/>
         <w:t xml:space="preserve"> 0</w:t>
       </w:r>
     </w:p>
     <w:p>
       <w:pPr>
         <w:keepLines/>
-        <w:rPr>
-          <w:highlight w:val="yellow"/>
-        </w:rPr>
+        <w:rPr/>
       </w:pPr>
       <w:r>
-        <w:rPr>
-          <w:highlight w:val="yellow"/>
-        </w:rPr>
+        <w:rPr/>
         <w:t xml:space="preserve">3536928 Aire </w:t>
       </w:r>
       <w:proofErr w:type="spellStart"/>
       <w:r>
-        <w:rPr>
-          <w:highlight w:val="yellow"/>
-        </w:rPr>
+        <w:rPr/>
         <w:t>Acondicionado</w:t>
       </w:r>
       <w:proofErr w:type="spellEnd"/>
       <w:r>
-        <w:rPr>
-          <w:highlight w:val="yellow"/>
-        </w:rPr>
+        <w:rPr/>
         <w:t xml:space="preserve"> </w:t>
       </w:r>
     </w:p>
     <w:p>
       <w:pPr>
         <w:keepLines/>
-        <w:rPr>
-          <w:highlight w:val="yellow"/>
-        </w:rPr>
+        <w:rPr/>
       </w:pPr>
       <w:proofErr w:type="spellStart"/>
       <w:r>
-        <w:rPr>
-          <w:highlight w:val="yellow"/>
-        </w:rPr>
+        <w:rPr/>
         <w:t>DualInverter</w:t>
       </w:r>
       <w:proofErr w:type="spellEnd"/>
       <w:r>
-        <w:rPr>
-          <w:highlight w:val="yellow"/>
-        </w:rPr>
+        <w:rPr/>
         <w:t xml:space="preserve"> LG 9000 Btu 220</w:t>
       </w:r>
     </w:p>
     <w:p>
       <w:pPr>
         <w:keepLines/>
-        <w:rPr>
-          <w:highlight w:val="yellow"/>
-        </w:rPr>
+        <w:rPr/>
       </w:pPr>
       <w:r>
-        <w:rPr>
-          <w:highlight w:val="yellow"/>
-        </w:rPr>
+        <w:rPr/>
         <w:t>V V09WIN.SJ0                   1.637.935A</w:t>
       </w:r>
     </w:p>
@@ -538,14 +442,12 @@
         <w:rPr>
           <w:b/>
           <w:bCs/>
-          <w:highlight w:val="yellow"/>
         </w:rPr>
       </w:pPr>
       <w:r>
         <w:rPr>
           <w:b/>
           <w:bCs/>
-          <w:highlight w:val="yellow"/>
         </w:rPr>
         <w:t xml:space="preserve">Total </w:t>
       </w:r>
@@ -554,7 +456,6 @@
         <w:rPr>
           <w:b/>
           <w:bCs/>
-          <w:highlight w:val="yellow"/>
         </w:rPr>
         <w:t>Item :</w:t>
       </w:r>
@@ -563,7 +464,6 @@
         <w:rPr>
           <w:b/>
           <w:bCs/>
-          <w:highlight w:val="yellow"/>
         </w:rPr>
         <w:t xml:space="preserve"> 3</w:t>
       </w:r>
@@ -574,179 +474,130 @@
         <w:rPr>
           <w:b/>
           <w:bCs/>
-          <w:highlight w:val="yellow"/>
         </w:rPr>
       </w:pPr>
     </w:p>
     <w:p>
       <w:pPr>
         <w:keepLines/>
-        <w:rPr>
-          <w:highlight w:val="yellow"/>
-        </w:rPr>
+        <w:rPr/>
       </w:pPr>
     </w:p>
     <w:p>
       <w:pPr>
         <w:keepLines/>
-        <w:rPr>
-          <w:highlight w:val="yellow"/>
-        </w:rPr>
+        <w:rPr/>
       </w:pPr>
       <w:r>
-        <w:rPr>
-          <w:highlight w:val="yellow"/>
-        </w:rPr>
+        <w:rPr/>
         <w:t>SUBTOTAL                      10.503.202</w:t>
       </w:r>
     </w:p>
     <w:p>
       <w:pPr>
         <w:keepLines/>
-        <w:rPr>
-          <w:highlight w:val="yellow"/>
-        </w:rPr>
+        <w:rPr/>
       </w:pPr>
       <w:r>
-        <w:rPr>
-          <w:highlight w:val="yellow"/>
-        </w:rPr>
+        <w:rPr/>
         <w:t>DESCUENTO                              0</w:t>
       </w:r>
     </w:p>
     <w:p>
       <w:pPr>
         <w:keepLines/>
-        <w:rPr>
-          <w:highlight w:val="yellow"/>
-        </w:rPr>
+        <w:rPr/>
       </w:pPr>
       <w:r>
-        <w:rPr>
-          <w:highlight w:val="yellow"/>
-        </w:rPr>
+        <w:rPr/>
         <w:t>AHORRO                                 0</w:t>
       </w:r>
     </w:p>
     <w:p>
       <w:pPr>
         <w:keepLines/>
-        <w:rPr>
-          <w:highlight w:val="yellow"/>
-        </w:rPr>
+        <w:rPr/>
       </w:pPr>
       <w:r>
-        <w:rPr>
-          <w:highlight w:val="yellow"/>
-        </w:rPr>
+        <w:rPr/>
         <w:t>VALOR TOTAL                   10.503.202</w:t>
       </w:r>
     </w:p>
     <w:p>
       <w:pPr>
         <w:keepLines/>
-        <w:rPr>
-          <w:highlight w:val="yellow"/>
-        </w:rPr>
+        <w:rPr/>
       </w:pPr>
       <w:r>
-        <w:rPr>
-          <w:highlight w:val="yellow"/>
-        </w:rPr>
+        <w:rPr/>
         <w:t xml:space="preserve">FORMA </w:t>
       </w:r>
       <w:proofErr w:type="gramStart"/>
       <w:r>
-        <w:rPr>
-          <w:highlight w:val="yellow"/>
-        </w:rPr>
+        <w:rPr/>
         <w:t>PAGO :T</w:t>
       </w:r>
       <w:proofErr w:type="gramEnd"/>
       <w:r>
-        <w:rPr>
-          <w:highlight w:val="yellow"/>
-        </w:rPr>
+        <w:rPr/>
         <w:t>.DEBITO</w:t>
       </w:r>
     </w:p>
     <w:p>
       <w:pPr>
         <w:keepLines/>
-        <w:rPr>
-          <w:highlight w:val="yellow"/>
-        </w:rPr>
+        <w:rPr/>
       </w:pPr>
       <w:r>
-        <w:rPr>
-          <w:highlight w:val="yellow"/>
-        </w:rPr>
+        <w:rPr/>
         <w:t>PAGA                          10.503.202</w:t>
       </w:r>
     </w:p>
     <w:p>
       <w:pPr>
         <w:keepLines/>
-        <w:rPr>
-          <w:highlight w:val="yellow"/>
-        </w:rPr>
+        <w:rPr/>
       </w:pPr>
       <w:r>
-        <w:rPr>
-          <w:highlight w:val="yellow"/>
-        </w:rPr>
+        <w:rPr/>
         <w:t>CAMBIO                                 0</w:t>
       </w:r>
     </w:p>
     <w:p>
       <w:pPr>
         <w:keepLines/>
-        <w:rPr>
-          <w:highlight w:val="yellow"/>
-        </w:rPr>
+        <w:rPr/>
       </w:pPr>
     </w:p>
     <w:p>
       <w:pPr>
         <w:keepLines/>
-        <w:rPr>
-          <w:highlight w:val="yellow"/>
-        </w:rPr>
+        <w:rPr/>
       </w:pPr>
     </w:p>
     <w:p>
       <w:pPr>
         <w:keepLines/>
-        <w:rPr>
-          <w:highlight w:val="yellow"/>
-        </w:rPr>
+        <w:rPr/>
       </w:pPr>
       <w:r>
-        <w:rPr>
-          <w:highlight w:val="yellow"/>
-        </w:rPr>
+        <w:rPr/>
         <w:t>DISCRIMINACION TARIFAS IMPUESTOS</w:t>
       </w:r>
     </w:p>
     <w:p>
       <w:pPr>
         <w:keepLines/>
-        <w:rPr>
-          <w:highlight w:val="yellow"/>
-        </w:rPr>
+        <w:rPr/>
       </w:pPr>
       <w:proofErr w:type="gramStart"/>
       <w:r>
-        <w:rPr>
-          <w:highlight w:val="yellow"/>
-        </w:rPr>
+        <w:rPr/>
         <w:t>TARIFA  COMPRA</w:t>
       </w:r>
       <w:proofErr w:type="gramEnd"/>
       <w:r>
-        <w:rPr>
-          <w:highlight w:val="yellow"/>
-        </w:rPr>
+        <w:rPr/>
         <w:t xml:space="preserve">   BASE  IMPUESTO</w:t>
       </w:r>
     </w:p>
@@ -755,9 +606,7 @@
         <w:keepLines/>
       </w:pPr>
       <w:r>
-        <w:rPr>
-          <w:highlight w:val="yellow"/>
-        </w:rPr>
+        <w:rPr/>
         <w:t>A-IVA=19%10.503.202 8.826.220 1.676.982</w:t>
       </w:r>
     </w:p>
@@ -800,37 +649,27 @@
         <w:keepLines/>
       </w:pPr>
       <w:r>
-        <w:rPr>
-          <w:highlight w:val="yellow"/>
-        </w:rPr>
+        <w:rPr/>
         <w:t xml:space="preserve">F. </w:t>
       </w:r>
       <w:proofErr w:type="spellStart"/>
       <w:r>
-        <w:rPr>
-          <w:highlight w:val="yellow"/>
-        </w:rPr>
+        <w:rPr/>
         <w:t>Expedicion</w:t>
       </w:r>
       <w:proofErr w:type="spellEnd"/>
       <w:r>
-        <w:rPr>
-          <w:highlight w:val="yellow"/>
-        </w:rPr>
+        <w:rPr/>
         <w:t>: 2026-08-06 08:30:08. 849</w:t>
       </w:r>
     </w:p>
     <w:p>
       <w:pPr>
         <w:keepLines/>
-        <w:rPr>
-          <w:highlight w:val="yellow"/>
-        </w:rPr>
+        <w:rPr/>
       </w:pPr>
       <w:r>
-        <w:rPr>
-          <w:highlight w:val="yellow"/>
-        </w:rPr>
+        <w:rPr/>
         <w:t>Cufe:5f9d9749239a44209e578fb8e6e4192f5b</w:t>
       </w:r>
     </w:p>
@@ -839,9 +678,7 @@
         <w:keepLines/>
       </w:pPr>
       <w:r>
-        <w:rPr>
-          <w:highlight w:val="yellow"/>
-        </w:rPr>
+        <w:rPr/>
         <w:t>2b5aebe6374cf7af3c98e5215e78c7</w:t>
       </w:r>
     </w:p>
@@ -1018,14 +855,10 @@
     <w:p>
       <w:pPr>
         <w:keepLines/>
-        <w:rPr>
-          <w:highlight w:val="yellow"/>
-        </w:rPr>
+        <w:rPr/>
       </w:pPr>
       <w:r>
-        <w:rPr>
-          <w:highlight w:val="yellow"/>
-        </w:rPr>
+        <w:rPr/>
         <w:t>&gt;&gt; MAPA:6536 ID: 2026080-6276768</w:t>
       </w:r>
     </w:p>
@@ -1034,9 +867,7 @@
         <w:keepLines/>
       </w:pPr>
       <w:r>
-        <w:rPr>
-          <w:highlight w:val="yellow"/>
-        </w:rPr>
+        <w:rPr/>
         <w:t>NUTRX:20260806058000081234</w:t>
       </w:r>
     </w:p>

</xml_diff>